<commit_message>
Ajustando detalles visuales de la BEO
</commit_message>
<xml_diff>
--- a/templates/memo-estacionamiento.docx
+++ b/templates/memo-estacionamiento.docx
@@ -305,54 +305,12 @@
         <w:tabs>
           <w:tab w:val="left" w:leader="none" w:pos="2835"/>
         </w:tabs>
-        <w:spacing w:line="360" w:lineRule="auto"/>
-        <w:jc w:val="both"/>
-        <w:rPr>
-          <w:rFonts w:ascii="Bookman Old Style" w:cs="Bookman Old Style" w:eastAsia="Bookman Old Style" w:hAnsi="Bookman Old Style"/>
-        </w:rPr>
-      </w:pPr>
-      <w:r>
-        <w:rPr>
-          <w:rFonts w:ascii="Bookman Old Style" w:cs="Bookman Old Style" w:eastAsia="Bookman Old Style" w:hAnsi="Bookman Old Style"/>
-        </w:rPr>
-        <w:drawing>
-          <wp:inline distB="114300" distT="114300" distL="114300" distR="114300">
-            <wp:extent cx="3009900" cy="1905000"/>
-            <wp:effectExtent b="0" l="0" r="0" t="0"/>
-            <wp:docPr id="34" name="image1.png"/>
-            <a:graphic>
-              <a:graphicData uri="http://schemas.openxmlformats.org/drawingml/2006/picture">
-                <pic:pic>
-                  <pic:nvPicPr>
-                    <pic:cNvPr id="0" name="image1.png"/>
-                    <pic:cNvPicPr preferRelativeResize="0"/>
-                  </pic:nvPicPr>
-                  <pic:blipFill>
-                    <a:blip r:embed="rId8"/>
-                    <a:srcRect b="0" l="0" r="0" t="0"/>
-                    <a:stretch>
-                      <a:fillRect/>
-                    </a:stretch>
-                  </pic:blipFill>
-                  <pic:spPr>
-                    <a:xfrm>
-                      <a:off x="0" y="0"/>
-                      <a:ext cx="3009900" cy="1905000"/>
-                    </a:xfrm>
-                    <a:prstGeom prst="rect"/>
-                    <a:ln/>
-                  </pic:spPr>
-                </pic:pic>
-              </a:graphicData>
-            </a:graphic>
-          </wp:inline>
-        </w:drawing>
-      </w:r>
-      <w:r>
-        <w:rPr>
-          <w:rtl w:val="0"/>
-        </w:rPr>
-      </w:r>
+        <w:spacing w:before="0" w:after="0" w:line="3000" w:lineRule="exact"/>
+        <w:jc w:val="both"/>
+        <w:rPr>
+          <w:rFonts w:ascii="Bookman Old Style" w:cs="Bookman Old Style" w:eastAsia="Bookman Old Style" w:hAnsi="Bookman Old Style"/>
+        </w:rPr>
+      </w:pPr>
     </w:p>
     <w:p>
       <w:pPr>

</xml_diff>